<commit_message>
Update document 1 in WebDevFund with new content
</commit_message>
<xml_diff>
--- a/1-WebDevFund/实验1.docx
+++ b/1-WebDevFund/实验1.docx
@@ -1332,20 +1332,29 @@
         <w:pStyle w:val="ac"/>
         <w:ind w:left="576" w:firstLineChars="0" w:firstLine="0"/>
         <w:rPr>
+          <w:rFonts w:hAnsi="宋体"/>
+          <w:b/>
+          <w:sz w:val="28"/>
+          <w:szCs w:val="28"/>
+        </w:rPr>
+      </w:pPr>
+      <w:r>
+        <w:rPr>
           <w:rFonts w:hAnsi="宋体" w:hint="eastAsia"/>
           <w:b/>
           <w:sz w:val="28"/>
           <w:szCs w:val="28"/>
         </w:rPr>
-      </w:pPr>
-      <w:r>
-        <w:rPr>
-          <w:rFonts w:hAnsi="宋体" w:hint="eastAsia"/>
+        <w:t>完整代码：</w:t>
+      </w:r>
+      <w:r>
+        <w:rPr>
+          <w:rFonts w:hAnsi="宋体"/>
           <w:b/>
           <w:sz w:val="28"/>
           <w:szCs w:val="28"/>
         </w:rPr>
-        <w:t>完整代码：</w:t>
+        <w:t>https://github.com/godsboy404/WebLearn</w:t>
       </w:r>
     </w:p>
     <w:p>
@@ -2930,7 +2939,7 @@
         <w:pStyle w:val="2"/>
         <w:spacing w:before="324" w:after="120"/>
         <w:rPr>
-          <w:rFonts w:cs="Arial" w:hint="eastAsia"/>
+          <w:rFonts w:cs="Arial"/>
           <w:b w:val="0"/>
           <w:bCs w:val="0"/>
           <w:color w:val="000000" w:themeColor="text1"/>
@@ -5070,7 +5079,7 @@
         <w:spacing w:before="120" w:after="120" w:line="324" w:lineRule="atLeast"/>
         <w:jc w:val="left"/>
         <w:rPr>
-          <w:rFonts w:ascii="Arial" w:hAnsi="Arial" w:cs="Arial" w:hint="eastAsia"/>
+          <w:rFonts w:ascii="Arial" w:hAnsi="Arial" w:cs="Arial"/>
           <w:color w:val="000000" w:themeColor="text1"/>
           <w:sz w:val="20"/>
           <w:szCs w:val="20"/>
@@ -5346,7 +5355,7 @@
         <w:pStyle w:val="ac"/>
         <w:ind w:left="576" w:firstLineChars="0" w:firstLine="0"/>
         <w:rPr>
-          <w:rFonts w:hAnsi="宋体" w:hint="eastAsia"/>
+          <w:rFonts w:hAnsi="宋体"/>
           <w:b/>
           <w:sz w:val="28"/>
           <w:szCs w:val="28"/>
@@ -7672,6 +7681,7 @@
   <w:style w:type="character" w:default="1" w:styleId="a0">
     <w:name w:val="Default Paragraph Font"/>
     <w:uiPriority w:val="1"/>
+    <w:semiHidden/>
     <w:unhideWhenUsed/>
   </w:style>
   <w:style w:type="table" w:default="1" w:styleId="a1">

</xml_diff>